<commit_message>
Tłumaczenia gier GMT: decyzje użytkownika z 30.10 (TS 2.0, scenariusz Apogeum, ZSRR w 11.1, TURN 4+, BB s. 2, 4, 30), przebudowane PDF i DOCX TS, aktualizacja przekazania
Co-Authored-By: Claude Opus 5.5 <noreply@anthropic.com>
Claude-Session: https://claude.ai/code/session_011F5uiw9gW8cnnoXX25MovS
</commit_message>
<xml_diff>
--- a/tlumaczenia_gier/Twilight_Struggle/TS_20th_Ann_Background_Book_WEB_PL.docx
+++ b/tlumaczenia_gier/Twilight_Struggle/TS_20th_Ann_Background_Book_WEB_PL.docx
@@ -253,7 +253,7 @@
         <w:pStyle w:val="BodyText"/>
       </w:pPr>
       <w:r>
-        <w:t xml:space="preserve">Aby ułatwić graczom śledzenie przebiegu partii, w nawiasach podano liczbę Punktów Wpływów (Influence points) w państwie po wykonaniu danej czynności. Liczba przed ukośnikiem to Wpływy USA (US Influence), a liczba po ukośniku – Wpływy ZSRR (USA/ZSRR). Zaznaczono także Kontrolę (Control) nad państwem.</w:t>
+        <w:t xml:space="preserve">Aby ułatwić graczom śledzenie przebiegu partii, w nawiasach podano liczbę Punktów Wpływów (Influence points) w państwie po wykonaniu danej czynności. Liczba przed ukośnikiem to Wpływy USA (US Influence), a liczba po ukośniku – Wpływy ZSRR (USSR Influence) – zapis (USA/ZSRR). Zaznaczono także Kontrolę (Control) nad państwem.</w:t>
       </w:r>
     </w:p>
     <w:p>
@@ -1920,7 +1920,7 @@
         <w:t xml:space="preserve">Arab‑Israeli War</w:t>
       </w:r>
       <w:r>
-        <w:t xml:space="preserve">, Wydarzenie ZSRR).</w:t>
+        <w:t xml:space="preserve">, Wydarzenie ZSRR)</w:t>
       </w:r>
     </w:p>
     <w:p>
@@ -14937,7 +14937,7 @@
         <w:pStyle w:val="FirstParagraph"/>
       </w:pPr>
       <w:r>
-        <w:t xml:space="preserve">(1969) Willy Brandt, żarliwy socjalista, a w młodości przeciwnik partii nazistowskiej, w 1969 roku poprowadził zachodnioniemiecką partię socjaldemokratyczną do zdobycia urzędu kanclerza. Na tym stanowisku stosował to samo pragmatyczne podejście do kontaktów Wschód–Zachód, które cechowało jego urzędowanie jako burmistrza Berlina Zachodniego. W ramach polityki nazwanej</w:t>
+        <w:t xml:space="preserve">(1969) Willy Brandt, żarliwy socjalista, a w młodości przeciwnik partii nazistowskiej, w 1969 roku poprowadził zachodnioniemiecką partię socjaldemokratyczną [przyp. red.: w oryginale „Socialist Democratic party”; chodzi o SPD] do zdobycia urzędu kanclerza. Na tym stanowisku stosował to samo pragmatyczne podejście do kontaktów Wschód–Zachód, które cechowało jego urzędowanie jako burmistrza Berlina Zachodniego. W ramach polityki nazwanej</w:t>
       </w:r>
       <w:r>
         <w:t xml:space="preserve"> </w:t>

</xml_diff>